<commit_message>
Remove MGM station series; merge Supporting Information; add DOI badge and ORCIDs
</commit_message>
<xml_diff>
--- a/Supporting_Information.docx
+++ b/Supporting_Information.docx
@@ -2,7 +2,7 @@
 <file path=word/document.xml><?xml version="1.0" encoding="utf-8"?>
 <w:document xmlns:w="http://schemas.openxmlformats.org/wordprocessingml/2006/main" xmlns:m="http://schemas.openxmlformats.org/officeDocument/2006/math" xmlns:r="http://schemas.openxmlformats.org/officeDocument/2006/relationships" xmlns:o="urn:schemas-microsoft-com:office:office" xmlns:v="urn:schemas-microsoft-com:vml" xmlns:w10="urn:schemas-microsoft-com:office:word" xmlns:a="http://schemas.openxmlformats.org/drawingml/2006/main" xmlns:pic="http://schemas.openxmlformats.org/drawingml/2006/picture" xmlns:wp="http://schemas.openxmlformats.org/drawingml/2006/wordprocessingDrawing">
   <w:body>
-    <w:bookmarkStart w:id="25" w:name="supporting-information"/>
+    <w:bookmarkStart w:id="0" w:name="supporting-information"/>
     <w:p>
       <w:pPr>
         <w:pStyle w:val="Heading1"/>
@@ -44,7 +44,7 @@
         <w:pStyle w:val="BodyText"/>
       </w:pPr>
       <w:r>
-        <w:t>This document indexes the code and analysis-ready data that reproduce every statistical result, table and figure in the main text. The package is archived in a permanent public repository (Zenodo; DOI [to be inserted at proof stage]). The code is released under the MIT licence and the derived data under CC BY 4.0; the raw MGM (meteorology) and TÜİK (yield) records from which the derived products were computed are not redistributed and remain subject to the terms of those agencies (Section 6).</w:t>
+        <w:t>This document indexes the code and analysis-ready data that reproduce every statistical result, table and figure in the main text. The package is archived in a permanent public repository (Zenodo: https://doi.org/10.5281/zenodo.21931123). The code is released under the MIT licence and the derived data under CC BY 4.0; the raw MGM (meteorology) and TÜİK (yield) records from which the derived products were computed are not redistributed and remain subject to the terms of those agencies (Section 6).</w:t>
       </w:r>
       <w:r/>
       <w:r>
@@ -53,9 +53,19 @@
           <w:i/>
         </w:rPr>
       </w:r>
-      <w:r/>
-    </w:p>
-    <w:bookmarkStart w:id="20" w:name="reproduction"/>
+      <w:r>
+        <w:t xml:space="preserve"> The version-controlled source repository is at https://github.com/cantekinkivrak/thrace-drought-scales.</w:t>
+      </w:r>
+    </w:p>
+    <w:bookmarkStart w:id="1" w:name="reproduction"/>
+    <w:p>
+      <w:pPr>
+        <w:pStyle w:val="Heading2"/>
+      </w:pPr>
+      <w:r>
+        <w:t>Appendix S1. Data, code and reproduction</w:t>
+      </w:r>
+    </w:p>
     <w:p>
       <w:pPr>
         <w:pStyle w:val="Heading2"/>
@@ -111,8 +121,8 @@
         <w:t>The Landsat extraction (code/01_landsat_vhi.ipynb and the Earth Engine parts of code/08_resolution_sensitivity.ipynb) additionally requires a Google Earth Engine account and the district assets; it is not needed to reproduce the statistics, which run from the derived files.</w:t>
       </w:r>
     </w:p>
-    <w:bookmarkEnd w:id="20"/>
-    <w:bookmarkStart w:id="21" w:name="code"/>
+    <w:bookmarkEnd w:id="0"/>
+    <w:bookmarkStart w:id="2" w:name="code"/>
     <w:p>
       <w:pPr>
         <w:pStyle w:val="Heading2"/>
@@ -488,8 +498,8 @@
         </w:tc>
       </w:tr>
     </w:tbl>
-    <w:bookmarkEnd w:id="21"/>
-    <w:bookmarkStart w:id="22" w:name="analysis-ready-data"/>
+    <w:bookmarkEnd w:id="1"/>
+    <w:bookmarkStart w:id="3" w:name="analysis-ready-data"/>
     <w:p>
       <w:pPr>
         <w:pStyle w:val="Heading2"/>
@@ -608,19 +618,19 @@
               <w:rPr>
                 <w:rStyle w:val="VerbatimChar"/>
               </w:rPr>
-              <w:t>data/trakya_TP_PET_1965_2024.csv</w:t>
-            </w:r>
-          </w:p>
-        </w:tc>
-        <w:tc>
-          <w:tcPr/>
-          <w:p>
-            <w:pPr>
-              <w:pStyle w:val="Compact"/>
-              <w:jc w:val="left"/>
-            </w:pPr>
-            <w:r>
-              <w:t xml:space="preserve">Station precipitation, temperature, Thornthwaite PET, water balance</w:t>
+              <w:t>data/scale_selection_multicriteria.csv</w:t>
+            </w:r>
+          </w:p>
+        </w:tc>
+        <w:tc>
+          <w:tcPr/>
+          <w:p>
+            <w:pPr>
+              <w:pStyle w:val="Compact"/>
+              <w:jc w:val="left"/>
+            </w:pPr>
+            <w:r>
+              <w:t xml:space="preserve">Four-criterion scores and composite ranking</w:t>
             </w:r>
           </w:p>
         </w:tc>
@@ -637,19 +647,26 @@
               <w:rPr>
                 <w:rStyle w:val="VerbatimChar"/>
               </w:rPr>
-              <w:t>data/scale_selection_multicriteria.csv</w:t>
-            </w:r>
-          </w:p>
-        </w:tc>
-        <w:tc>
-          <w:tcPr/>
-          <w:p>
-            <w:pPr>
-              <w:pStyle w:val="Compact"/>
-              <w:jc w:val="left"/>
-            </w:pPr>
-            <w:r>
-              <w:t xml:space="preserve">Four-criterion scores and composite ranking</w:t>
+              <w:t>data/yield_panel_sunflower.csv, …_wheat.csv</w:t>
+            </w:r>
+            <w:r/>
+            <w:r/>
+            <w:r>
+              <w:rPr>
+                <w:rStyle w:val="VerbatimChar"/>
+              </w:rPr>
+            </w:r>
+          </w:p>
+        </w:tc>
+        <w:tc>
+          <w:tcPr/>
+          <w:p>
+            <w:pPr>
+              <w:pStyle w:val="Compact"/>
+              <w:jc w:val="left"/>
+            </w:pPr>
+            <w:r>
+              <w:t xml:space="preserve">District yield panels with growing-season SPEI</w:t>
             </w:r>
           </w:p>
         </w:tc>
@@ -666,27 +683,86 @@
               <w:rPr>
                 <w:rStyle w:val="VerbatimChar"/>
               </w:rPr>
-              <w:t>data/yield_panel_sunflower.csv, …_wheat.csv</w:t>
+              <w:t>data/bootstrap_selection_frequency.csv, data/categorical_skill_summary.csv, data/distribution_fit_diagnostics.csv, data/sensitivity_summary.csv</w:t>
+            </w:r>
+          </w:p>
+        </w:tc>
+        <w:tc>
+          <w:tcPr/>
+          <w:p>
+            <w:pPr>
+              <w:pStyle w:val="Compact"/>
+              <w:jc w:val="left"/>
+            </w:pPr>
+            <w:r>
+              <w:t>Bootstrap selection frequencies; POD/FAR/CSI/bias/HSS with confidence intervals; per-station distribution-fit diagnostics; scale selection under seven alternative specifications</w:t>
+            </w:r>
+          </w:p>
+        </w:tc>
+      </w:tr>
+      <w:tr>
+        <w:tc>
+          <w:tcPr/>
+          <w:p>
+            <w:pPr>
+              <w:pStyle w:val="Compact"/>
+              <w:jc w:val="left"/>
+            </w:pPr>
+            <w:r>
+              <w:rPr>
+                <w:rStyle w:val="VerbatimChar"/>
+              </w:rPr>
+              <w:t>data/trakya_resolution_sensitivity.csv</w:t>
+            </w:r>
+          </w:p>
+        </w:tc>
+        <w:tc>
+          <w:tcPr/>
+          <w:p>
+            <w:pPr>
+              <w:pStyle w:val="Compact"/>
+              <w:jc w:val="left"/>
+            </w:pPr>
+            <w:r>
+              <w:t xml:space="preserve">District monthly NDVI/LST by arm (masked/unmasked) × resolution (30/250/500/900 m)</w:t>
+            </w:r>
+          </w:p>
+        </w:tc>
+      </w:tr>
+      <w:tr>
+        <w:tc>
+          <w:tcPr/>
+          <w:p>
+            <w:pPr>
+              <w:pStyle w:val="Compact"/>
+              <w:jc w:val="left"/>
+            </w:pPr>
+            <w:r>
+              <w:rPr>
+                <w:rStyle w:val="VerbatimChar"/>
+              </w:rPr>
+              <w:t xml:space="preserve">data/spatial/Trakya_Merged.shp</w:t>
+            </w:r>
+          </w:p>
+        </w:tc>
+        <w:tc>
+          <w:tcPr/>
+          <w:p>
+            <w:pPr>
+              <w:pStyle w:val="Compact"/>
+              <w:jc w:val="left"/>
+            </w:pPr>
+            <w:r>
+              <w:t>District boundaries used for the zonal aggregation (with .dbf/.shx/.prj/.cpg)</w:t>
+            </w:r>
+            <w:r/>
+            <w:r>
+              <w:rPr>
+                <w:rStyle w:val="VerbatimChar"/>
+              </w:rPr>
             </w:r>
             <w:r/>
             <w:r/>
-            <w:r>
-              <w:rPr>
-                <w:rStyle w:val="VerbatimChar"/>
-              </w:rPr>
-            </w:r>
-          </w:p>
-        </w:tc>
-        <w:tc>
-          <w:tcPr/>
-          <w:p>
-            <w:pPr>
-              <w:pStyle w:val="Compact"/>
-              <w:jc w:val="left"/>
-            </w:pPr>
-            <w:r>
-              <w:t xml:space="preserve">District yield panels with growing-season SPEI</w:t>
-            </w:r>
           </w:p>
         </w:tc>
       </w:tr>
@@ -702,20 +778,28 @@
               <w:rPr>
                 <w:rStyle w:val="VerbatimChar"/>
               </w:rPr>
-              <w:t>data/bootstrap_selection_frequency.csv, data/categorical_skill_summary.csv, data/distribution_fit_diagnostics.csv, data/sensitivity_summary.csv</w:t>
-            </w:r>
-          </w:p>
-        </w:tc>
-        <w:tc>
-          <w:tcPr/>
-          <w:p>
-            <w:pPr>
-              <w:pStyle w:val="Compact"/>
-              <w:jc w:val="left"/>
-            </w:pPr>
-            <w:r>
-              <w:t>Bootstrap selection frequencies; POD/FAR/CSI/bias/HSS with confidence intervals; per-station distribution-fit diagnostics; scale selection under seven alternative specifications</w:t>
-            </w:r>
+              <w:t>data/spatial/station_info.xlsx</w:t>
+            </w:r>
+          </w:p>
+        </w:tc>
+        <w:tc>
+          <w:tcPr/>
+          <w:p>
+            <w:pPr>
+              <w:pStyle w:val="Compact"/>
+              <w:jc w:val="left"/>
+            </w:pPr>
+            <w:r>
+              <w:t>Station names, coordinates and elevations</w:t>
+            </w:r>
+            <w:r/>
+            <w:r>
+              <w:rPr>
+                <w:rStyle w:val="VerbatimChar"/>
+              </w:rPr>
+            </w:r>
+            <w:r/>
+            <w:r/>
           </w:p>
         </w:tc>
       </w:tr>
@@ -731,48 +815,19 @@
               <w:rPr>
                 <w:rStyle w:val="VerbatimChar"/>
               </w:rPr>
-              <w:t>data/trakya_resolution_sensitivity.csv</w:t>
-            </w:r>
-          </w:p>
-        </w:tc>
-        <w:tc>
-          <w:tcPr/>
-          <w:p>
-            <w:pPr>
-              <w:pStyle w:val="Compact"/>
-              <w:jc w:val="left"/>
-            </w:pPr>
-            <w:r>
-              <w:t xml:space="preserve">District monthly NDVI/LST by arm (masked/unmasked) × resolution (30/250/500/900 m)</w:t>
-            </w:r>
-          </w:p>
-        </w:tc>
-      </w:tr>
-      <w:tr>
-        <w:tc>
-          <w:tcPr/>
-          <w:p>
-            <w:pPr>
-              <w:pStyle w:val="Compact"/>
-              <w:jc w:val="left"/>
-            </w:pPr>
-            <w:r>
-              <w:rPr>
-                <w:rStyle w:val="VerbatimChar"/>
-              </w:rPr>
-              <w:t xml:space="preserve">data/spatial/Trakya_Merged.shp</w:t>
-            </w:r>
-          </w:p>
-        </w:tc>
-        <w:tc>
-          <w:tcPr/>
-          <w:p>
-            <w:pPr>
-              <w:pStyle w:val="Compact"/>
-              <w:jc w:val="left"/>
-            </w:pPr>
-            <w:r>
-              <w:t>District boundaries used for the zonal aggregation (with .dbf/.shx/.prj/.cpg)</w:t>
+              <w:t>data/ipsala_coupling_subperiods.csv</w:t>
+            </w:r>
+          </w:p>
+        </w:tc>
+        <w:tc>
+          <w:tcPr/>
+          <w:p>
+            <w:pPr>
+              <w:pStyle w:val="Compact"/>
+              <w:jc w:val="left"/>
+            </w:pPr>
+            <w:r>
+              <w:t>District VHI–SPEI-3 correlations by sub-period and normalisation baseline (Section 3.5; tabulated as Table S2)</w:t>
             </w:r>
             <w:r/>
             <w:r>
@@ -785,83 +840,9 @@
           </w:p>
         </w:tc>
       </w:tr>
-      <w:tr>
-        <w:tc>
-          <w:tcPr/>
-          <w:p>
-            <w:pPr>
-              <w:pStyle w:val="Compact"/>
-              <w:jc w:val="left"/>
-            </w:pPr>
-            <w:r>
-              <w:rPr>
-                <w:rStyle w:val="VerbatimChar"/>
-              </w:rPr>
-              <w:t>data/spatial/station_info.xlsx</w:t>
-            </w:r>
-          </w:p>
-        </w:tc>
-        <w:tc>
-          <w:tcPr/>
-          <w:p>
-            <w:pPr>
-              <w:pStyle w:val="Compact"/>
-              <w:jc w:val="left"/>
-            </w:pPr>
-            <w:r>
-              <w:t>Station names, coordinates and elevations</w:t>
-            </w:r>
-            <w:r/>
-            <w:r>
-              <w:rPr>
-                <w:rStyle w:val="VerbatimChar"/>
-              </w:rPr>
-            </w:r>
-            <w:r/>
-            <w:r/>
-          </w:p>
-        </w:tc>
-      </w:tr>
-      <w:tr>
-        <w:tc>
-          <w:tcPr/>
-          <w:p>
-            <w:pPr>
-              <w:pStyle w:val="Compact"/>
-              <w:jc w:val="left"/>
-            </w:pPr>
-            <w:r>
-              <w:rPr>
-                <w:rStyle w:val="VerbatimChar"/>
-              </w:rPr>
-              <w:t>data/ipsala_coupling_subperiods.csv</w:t>
-            </w:r>
-          </w:p>
-        </w:tc>
-        <w:tc>
-          <w:tcPr/>
-          <w:p>
-            <w:pPr>
-              <w:pStyle w:val="Compact"/>
-              <w:jc w:val="left"/>
-            </w:pPr>
-            <w:r>
-              <w:t>District VHI–SPEI-3 correlations by sub-period (1985–2012, 2013–2024, full record) under the paper normalisation and under a within-window normalisation (Section 3.5)</w:t>
-            </w:r>
-            <w:r/>
-            <w:r>
-              <w:rPr>
-                <w:rStyle w:val="VerbatimChar"/>
-              </w:rPr>
-            </w:r>
-            <w:r/>
-            <w:r/>
-          </w:p>
-        </w:tc>
-      </w:tr>
     </w:tbl>
-    <w:bookmarkEnd w:id="22"/>
-    <w:bookmarkStart w:id="23" w:name="supplementary-figures"/>
+    <w:bookmarkEnd w:id="2"/>
+    <w:bookmarkStart w:id="4" w:name="supplementary-figures"/>
     <w:p>
       <w:pPr>
         <w:pStyle w:val="Heading2"/>
@@ -922,19 +903,19 @@
               <w:rPr>
                 <w:rStyle w:val="VerbatimChar"/>
               </w:rPr>
-              <w:t xml:space="preserve">Supplementary_Station_Figures.docx</w:t>
-            </w:r>
-          </w:p>
-        </w:tc>
-        <w:tc>
-          <w:tcPr/>
-          <w:p>
-            <w:pPr>
-              <w:pStyle w:val="Compact"/>
-              <w:jc w:val="left"/>
-            </w:pPr>
-            <w:r>
-              <w:t xml:space="preserve">Per-station SPI, SPEI and VHI time series for all seven districts (supplementary figures S1–S7)</w:t>
+              <w:t>Appendix S2 of this document</w:t>
+            </w:r>
+          </w:p>
+        </w:tc>
+        <w:tc>
+          <w:tcPr/>
+          <w:p>
+            <w:pPr>
+              <w:pStyle w:val="Compact"/>
+              <w:jc w:val="left"/>
+            </w:pPr>
+            <w:r>
+              <w:t>Per-station SPI-3, SPEI-3 and VHI series for all seven districts (Figures S1–S7) with Tables S1 and S2</w:t>
             </w:r>
           </w:p>
         </w:tc>
@@ -1035,8 +1016,8 @@
         <w:t xml:space="preserve">Main-text Figures 1–9 are regenerated by the figure scripts in Section 2.</w:t>
       </w:r>
     </w:p>
-    <w:bookmarkEnd w:id="23"/>
-    <w:bookmarkStart w:id="24" w:name="Xb815bcf5b131f38c45de63ace6414d2f9e12574"/>
+    <w:bookmarkEnd w:id="3"/>
+    <w:bookmarkStart w:id="5" w:name="Xb815bcf5b131f38c45de63ace6414d2f9e12574"/>
     <w:p>
       <w:pPr>
         <w:pStyle w:val="Heading2"/>
@@ -1062,9 +1043,8 @@
         <w:t xml:space="preserve">extracts district NDVI/LST in three arms — native 30 m cropland-masked (A), coarse cropland-masked (B) and coarse unmasked (C) — at 250, 500 and ~900 m, over the Landsat 8/9 era (2013–2024). VCI/TCI/VHI (α = 0.5) and the VHI–SPEI correlations are then computed per arm and resolution. The three-month optimum holds throughout; cropland masking raises the seasonal NDVI amplitude by ~11% independently of resolution, whereas sensor resolution has a limited effect on the district-mean correlations.</w:t>
       </w:r>
     </w:p>
-    <w:bookmarkEnd w:id="24"/>
-    <w:bookmarkEnd w:id="25"/>
-    <w:sectPr/>
+    <w:bookmarkEnd w:id="4"/>
+    <w:bookmarkEnd w:id="5"/>
     <w:p>
       <w:pPr>
         <w:pStyle w:val="Heading2"/>
@@ -1094,7 +1074,7 @@
         <w:pStyle w:val="BodyText"/>
       </w:pPr>
       <w:r>
-        <w:t>Every file under data/ is a derived product — monthly district-level aggregates, standardized indices, fitted diagnostics and summary tables computed by the authors. The underlying raw records are not included in the archive and are not covered by that licence. Daily and monthly station precipitation and temperature were supplied by the Turkish State Meteorological Service (MGM) for research use; MGM retains all rights and the raw station series may not be redistributed. District-level wheat and sunflower statistics were obtained from the Turkish Statistical Institute (TÜİK) under the same condition. Both should be requested directly from those agencies. The products distributed here are aggregated at a level that does not permit reconstruction of the raw station series or the underlying survey returns.</w:t>
+        <w:t>Every file under data/ is a derived product — monthly district-level aggregates, standardized indices, fitted diagnostics and summary tables computed by the authors. Neither the raw station records nor the monthly station precipitation and temperature series are included in the archive, in any form, and neither is covered by that licence; only the standardized (dimensionless) indices derived from them are distributed. Daily and monthly station precipitation and temperature were supplied by the Turkish State Meteorological Service (MGM) for research use; MGM retains all rights and the raw station series may not be redistributed. District-level wheat and sunflower statistics were obtained from the Turkish Statistical Institute (TÜİK) under the same condition. Both should be requested directly from those agencies. The products distributed here are aggregated at a level that does not permit reconstruction of the raw station series or the underlying survey returns.</w:t>
       </w:r>
       <w:r/>
       <w:r>
@@ -1121,6 +1101,1669 @@
       </w:r>
       <w:r/>
     </w:p>
+    <w:p>
+      <w:pPr>
+        <w:pStyle w:val="Heading2"/>
+      </w:pPr>
+      <w:r>
+        <w:t>Appendix S2. Station-level SPI-3, SPEI-3 and VHI series</w:t>
+      </w:r>
+    </w:p>
+    <w:p>
+      <w:pPr>
+        <w:jc w:val="center"/>
+      </w:pPr>
+      <w:r>
+        <w:rPr>
+          <w:i/>
+          <w:sz w:val="21"/>
+        </w:rPr>
+        <w:t>Supporting Information for ‘Purpose-dependent drought accumulation scales for canopy monitoring and yield prediction in rainfed Turkish Thrace: a cropland Landsat Vegetation Health Index evaluation’ — C. Kıvrak and M. Şener, International Journal of Climatology</w:t>
+      </w:r>
+    </w:p>
+    <w:p>
+      <w:pPr>
+        <w:pStyle w:val="Heading2"/>
+      </w:pPr>
+      <w:r>
+        <w:t>Scope and calculation</w:t>
+      </w:r>
+    </w:p>
+    <w:p>
+      <w:r>
+        <w:t>Figures S1–S7 show station/district-specific annual growing-season series for 1985–2024. SPI-3 and flexibly standardized Thornthwaite SPEI-3 were averaged over June–October for each meteorological station. VHI was calculated independently for the matching district cropland as 0.5 VCI + 0.5 TCI and then averaged over the same months. No temporal smoother was applied. All district-years contained at least three valid VHI months; means use the available valid observations.</w:t>
+      </w:r>
+    </w:p>
+    <w:p>
+      <w:r>
+        <w:t>Dashed lines at −1 and 40 are descriptive drought/stress references and are not the cross-validated threshold used in the categorical analysis. The shaded final interval identifies 2024. Pearson correlations in Table S1 and the legends compare annual June–October means and are descriptive.</w:t>
+      </w:r>
+    </w:p>
+    <w:p>
+      <w:r>
+        <w:t>Table S1. Station-level annual associations between June–October drought indices and VHI.</w:t>
+      </w:r>
+    </w:p>
+    <w:tbl>
+      <w:tblPr>
+        <w:tblStyle w:val="TableGrid"/>
+        <w:tblW w:type="auto" w:w="0"/>
+        <w:jc w:val="center"/>
+        <w:tblLayout w:type="autofit"/>
+        <w:tblLook w:firstColumn="1" w:firstRow="1" w:lastColumn="0" w:lastRow="0" w:noHBand="0" w:noVBand="1" w:val="04A0"/>
+      </w:tblPr>
+      <w:tblGrid>
+        <w:gridCol w:w="1531"/>
+        <w:gridCol w:w="1531"/>
+        <w:gridCol w:w="1531"/>
+        <w:gridCol w:w="1531"/>
+        <w:gridCol w:w="1531"/>
+        <w:gridCol w:w="1531"/>
+      </w:tblGrid>
+      <w:tr>
+        <w:trPr>
+          <w:tblHeader w:val="true"/>
+        </w:trPr>
+        <w:tc>
+          <w:tcPr>
+            <w:tcW w:type="dxa" w:w="1701"/>
+            <w:shd w:fill="D9E2F3"/>
+            <w:vAlign w:val="center"/>
+          </w:tcPr>
+          <w:p>
+            <w:r>
+              <w:rPr>
+                <w:b/>
+                <w:sz w:val="17"/>
+              </w:rPr>
+              <w:t>Station/district</w:t>
+            </w:r>
+          </w:p>
+        </w:tc>
+        <w:tc>
+          <w:tcPr>
+            <w:tcW w:type="dxa" w:w="1814"/>
+            <w:shd w:fill="D9E2F3"/>
+            <w:vAlign w:val="center"/>
+          </w:tcPr>
+          <w:p>
+            <w:r>
+              <w:rPr>
+                <w:b/>
+                <w:sz w:val="17"/>
+              </w:rPr>
+              <w:t>Role</w:t>
+            </w:r>
+          </w:p>
+        </w:tc>
+        <w:tc>
+          <w:tcPr>
+            <w:tcW w:type="dxa" w:w="907"/>
+            <w:shd w:fill="D9E2F3"/>
+            <w:vAlign w:val="center"/>
+          </w:tcPr>
+          <w:p>
+            <w:r>
+              <w:rPr>
+                <w:b/>
+                <w:sz w:val="17"/>
+              </w:rPr>
+              <w:t>Years</w:t>
+            </w:r>
+          </w:p>
+        </w:tc>
+        <w:tc>
+          <w:tcPr>
+            <w:tcW w:type="dxa" w:w="1474"/>
+            <w:shd w:fill="D9E2F3"/>
+            <w:vAlign w:val="center"/>
+          </w:tcPr>
+          <w:p>
+            <w:r>
+              <w:rPr>
+                <w:b/>
+                <w:sz w:val="17"/>
+              </w:rPr>
+              <w:t>r: SPI-3/VHI</w:t>
+            </w:r>
+          </w:p>
+        </w:tc>
+        <w:tc>
+          <w:tcPr>
+            <w:tcW w:type="dxa" w:w="1587"/>
+            <w:shd w:fill="D9E2F3"/>
+            <w:vAlign w:val="center"/>
+          </w:tcPr>
+          <w:p>
+            <w:r>
+              <w:rPr>
+                <w:b/>
+                <w:sz w:val="17"/>
+              </w:rPr>
+              <w:t>r: SPEI-3/VHI</w:t>
+            </w:r>
+          </w:p>
+        </w:tc>
+        <w:tc>
+          <w:tcPr>
+            <w:tcW w:type="dxa" w:w="1417"/>
+            <w:shd w:fill="D9E2F3"/>
+            <w:vAlign w:val="center"/>
+          </w:tcPr>
+          <w:p>
+            <w:r>
+              <w:rPr>
+                <w:b/>
+                <w:sz w:val="17"/>
+              </w:rPr>
+              <w:t>Min. valid months</w:t>
+            </w:r>
+          </w:p>
+        </w:tc>
+      </w:tr>
+      <w:tr>
+        <w:tc>
+          <w:tcPr>
+            <w:tcW w:type="dxa" w:w="1701"/>
+            <w:vAlign w:val="center"/>
+          </w:tcPr>
+          <w:p>
+            <w:pPr>
+              <w:spacing w:after="0"/>
+              <w:jc w:val="left"/>
+            </w:pPr>
+            <w:r>
+              <w:rPr>
+                <w:b/>
+                <w:sz w:val="16"/>
+              </w:rPr>
+              <w:t>Edirne</w:t>
+            </w:r>
+          </w:p>
+        </w:tc>
+        <w:tc>
+          <w:tcPr>
+            <w:tcW w:type="dxa" w:w="1814"/>
+            <w:vAlign w:val="center"/>
+          </w:tcPr>
+          <w:p>
+            <w:pPr>
+              <w:spacing w:after="0"/>
+              <w:jc w:val="center"/>
+            </w:pPr>
+            <w:r>
+              <w:rPr>
+                <w:sz w:val="16"/>
+              </w:rPr>
+              <w:t>Primary plateau</w:t>
+            </w:r>
+          </w:p>
+        </w:tc>
+        <w:tc>
+          <w:tcPr>
+            <w:tcW w:type="dxa" w:w="907"/>
+            <w:vAlign w:val="center"/>
+          </w:tcPr>
+          <w:p>
+            <w:pPr>
+              <w:spacing w:after="0"/>
+              <w:jc w:val="center"/>
+            </w:pPr>
+            <w:r>
+              <w:rPr>
+                <w:sz w:val="16"/>
+              </w:rPr>
+              <w:t>40</w:t>
+            </w:r>
+          </w:p>
+        </w:tc>
+        <w:tc>
+          <w:tcPr>
+            <w:tcW w:type="dxa" w:w="1474"/>
+            <w:vAlign w:val="center"/>
+          </w:tcPr>
+          <w:p>
+            <w:pPr>
+              <w:spacing w:after="0"/>
+              <w:jc w:val="center"/>
+            </w:pPr>
+            <w:r>
+              <w:rPr>
+                <w:sz w:val="16"/>
+              </w:rPr>
+              <w:t>0.537</w:t>
+            </w:r>
+          </w:p>
+        </w:tc>
+        <w:tc>
+          <w:tcPr>
+            <w:tcW w:type="dxa" w:w="1587"/>
+            <w:vAlign w:val="center"/>
+          </w:tcPr>
+          <w:p>
+            <w:pPr>
+              <w:spacing w:after="0"/>
+              <w:jc w:val="center"/>
+            </w:pPr>
+            <w:r>
+              <w:rPr>
+                <w:sz w:val="16"/>
+              </w:rPr>
+              <w:t>0.544</w:t>
+            </w:r>
+          </w:p>
+        </w:tc>
+        <w:tc>
+          <w:tcPr>
+            <w:tcW w:type="dxa" w:w="1417"/>
+            <w:vAlign w:val="center"/>
+          </w:tcPr>
+          <w:p>
+            <w:pPr>
+              <w:spacing w:after="0"/>
+              <w:jc w:val="center"/>
+            </w:pPr>
+            <w:r>
+              <w:rPr>
+                <w:sz w:val="16"/>
+              </w:rPr>
+              <w:t>4</w:t>
+            </w:r>
+          </w:p>
+        </w:tc>
+      </w:tr>
+      <w:tr>
+        <w:tc>
+          <w:tcPr>
+            <w:tcW w:type="dxa" w:w="1701"/>
+            <w:vAlign w:val="center"/>
+          </w:tcPr>
+          <w:p>
+            <w:pPr>
+              <w:spacing w:after="0"/>
+              <w:jc w:val="left"/>
+            </w:pPr>
+            <w:r>
+              <w:rPr>
+                <w:b/>
+                <w:sz w:val="16"/>
+              </w:rPr>
+              <w:t>Kırklareli</w:t>
+            </w:r>
+          </w:p>
+        </w:tc>
+        <w:tc>
+          <w:tcPr>
+            <w:tcW w:type="dxa" w:w="1814"/>
+            <w:vAlign w:val="center"/>
+          </w:tcPr>
+          <w:p>
+            <w:pPr>
+              <w:spacing w:after="0"/>
+              <w:jc w:val="center"/>
+            </w:pPr>
+            <w:r>
+              <w:rPr>
+                <w:sz w:val="16"/>
+              </w:rPr>
+              <w:t>Primary plateau</w:t>
+            </w:r>
+          </w:p>
+        </w:tc>
+        <w:tc>
+          <w:tcPr>
+            <w:tcW w:type="dxa" w:w="907"/>
+            <w:vAlign w:val="center"/>
+          </w:tcPr>
+          <w:p>
+            <w:pPr>
+              <w:spacing w:after="0"/>
+              <w:jc w:val="center"/>
+            </w:pPr>
+            <w:r>
+              <w:rPr>
+                <w:sz w:val="16"/>
+              </w:rPr>
+              <w:t>40</w:t>
+            </w:r>
+          </w:p>
+        </w:tc>
+        <w:tc>
+          <w:tcPr>
+            <w:tcW w:type="dxa" w:w="1474"/>
+            <w:vAlign w:val="center"/>
+          </w:tcPr>
+          <w:p>
+            <w:pPr>
+              <w:spacing w:after="0"/>
+              <w:jc w:val="center"/>
+            </w:pPr>
+            <w:r>
+              <w:rPr>
+                <w:sz w:val="16"/>
+              </w:rPr>
+              <w:t>0.544</w:t>
+            </w:r>
+          </w:p>
+        </w:tc>
+        <w:tc>
+          <w:tcPr>
+            <w:tcW w:type="dxa" w:w="1587"/>
+            <w:vAlign w:val="center"/>
+          </w:tcPr>
+          <w:p>
+            <w:pPr>
+              <w:spacing w:after="0"/>
+              <w:jc w:val="center"/>
+            </w:pPr>
+            <w:r>
+              <w:rPr>
+                <w:sz w:val="16"/>
+              </w:rPr>
+              <w:t>0.584</w:t>
+            </w:r>
+          </w:p>
+        </w:tc>
+        <w:tc>
+          <w:tcPr>
+            <w:tcW w:type="dxa" w:w="1417"/>
+            <w:vAlign w:val="center"/>
+          </w:tcPr>
+          <w:p>
+            <w:pPr>
+              <w:spacing w:after="0"/>
+              <w:jc w:val="center"/>
+            </w:pPr>
+            <w:r>
+              <w:rPr>
+                <w:sz w:val="16"/>
+              </w:rPr>
+              <w:t>4</w:t>
+            </w:r>
+          </w:p>
+        </w:tc>
+      </w:tr>
+      <w:tr>
+        <w:tc>
+          <w:tcPr>
+            <w:tcW w:type="dxa" w:w="1701"/>
+            <w:vAlign w:val="center"/>
+          </w:tcPr>
+          <w:p>
+            <w:pPr>
+              <w:spacing w:after="0"/>
+              <w:jc w:val="left"/>
+            </w:pPr>
+            <w:r>
+              <w:rPr>
+                <w:b/>
+                <w:sz w:val="16"/>
+              </w:rPr>
+              <w:t>Lüleburgaz</w:t>
+            </w:r>
+          </w:p>
+        </w:tc>
+        <w:tc>
+          <w:tcPr>
+            <w:tcW w:type="dxa" w:w="1814"/>
+            <w:vAlign w:val="center"/>
+          </w:tcPr>
+          <w:p>
+            <w:pPr>
+              <w:spacing w:after="0"/>
+              <w:jc w:val="center"/>
+            </w:pPr>
+            <w:r>
+              <w:rPr>
+                <w:sz w:val="16"/>
+              </w:rPr>
+              <w:t>Primary plateau</w:t>
+            </w:r>
+          </w:p>
+        </w:tc>
+        <w:tc>
+          <w:tcPr>
+            <w:tcW w:type="dxa" w:w="907"/>
+            <w:vAlign w:val="center"/>
+          </w:tcPr>
+          <w:p>
+            <w:pPr>
+              <w:spacing w:after="0"/>
+              <w:jc w:val="center"/>
+            </w:pPr>
+            <w:r>
+              <w:rPr>
+                <w:sz w:val="16"/>
+              </w:rPr>
+              <w:t>40</w:t>
+            </w:r>
+          </w:p>
+        </w:tc>
+        <w:tc>
+          <w:tcPr>
+            <w:tcW w:type="dxa" w:w="1474"/>
+            <w:vAlign w:val="center"/>
+          </w:tcPr>
+          <w:p>
+            <w:pPr>
+              <w:spacing w:after="0"/>
+              <w:jc w:val="center"/>
+            </w:pPr>
+            <w:r>
+              <w:rPr>
+                <w:sz w:val="16"/>
+              </w:rPr>
+              <w:t>0.404</w:t>
+            </w:r>
+          </w:p>
+        </w:tc>
+        <w:tc>
+          <w:tcPr>
+            <w:tcW w:type="dxa" w:w="1587"/>
+            <w:vAlign w:val="center"/>
+          </w:tcPr>
+          <w:p>
+            <w:pPr>
+              <w:spacing w:after="0"/>
+              <w:jc w:val="center"/>
+            </w:pPr>
+            <w:r>
+              <w:rPr>
+                <w:sz w:val="16"/>
+              </w:rPr>
+              <w:t>0.517</w:t>
+            </w:r>
+          </w:p>
+        </w:tc>
+        <w:tc>
+          <w:tcPr>
+            <w:tcW w:type="dxa" w:w="1417"/>
+            <w:vAlign w:val="center"/>
+          </w:tcPr>
+          <w:p>
+            <w:pPr>
+              <w:spacing w:after="0"/>
+              <w:jc w:val="center"/>
+            </w:pPr>
+            <w:r>
+              <w:rPr>
+                <w:sz w:val="16"/>
+              </w:rPr>
+              <w:t>3</w:t>
+            </w:r>
+          </w:p>
+        </w:tc>
+      </w:tr>
+      <w:tr>
+        <w:tc>
+          <w:tcPr>
+            <w:tcW w:type="dxa" w:w="1701"/>
+            <w:vAlign w:val="center"/>
+          </w:tcPr>
+          <w:p>
+            <w:pPr>
+              <w:spacing w:after="0"/>
+              <w:jc w:val="left"/>
+            </w:pPr>
+            <w:r>
+              <w:rPr>
+                <w:b/>
+                <w:sz w:val="16"/>
+              </w:rPr>
+              <w:t>Çorlu</w:t>
+            </w:r>
+          </w:p>
+        </w:tc>
+        <w:tc>
+          <w:tcPr>
+            <w:tcW w:type="dxa" w:w="1814"/>
+            <w:vAlign w:val="center"/>
+          </w:tcPr>
+          <w:p>
+            <w:pPr>
+              <w:spacing w:after="0"/>
+              <w:jc w:val="center"/>
+            </w:pPr>
+            <w:r>
+              <w:rPr>
+                <w:sz w:val="16"/>
+              </w:rPr>
+              <w:t>Primary plateau</w:t>
+            </w:r>
+          </w:p>
+        </w:tc>
+        <w:tc>
+          <w:tcPr>
+            <w:tcW w:type="dxa" w:w="907"/>
+            <w:vAlign w:val="center"/>
+          </w:tcPr>
+          <w:p>
+            <w:pPr>
+              <w:spacing w:after="0"/>
+              <w:jc w:val="center"/>
+            </w:pPr>
+            <w:r>
+              <w:rPr>
+                <w:sz w:val="16"/>
+              </w:rPr>
+              <w:t>40</w:t>
+            </w:r>
+          </w:p>
+        </w:tc>
+        <w:tc>
+          <w:tcPr>
+            <w:tcW w:type="dxa" w:w="1474"/>
+            <w:vAlign w:val="center"/>
+          </w:tcPr>
+          <w:p>
+            <w:pPr>
+              <w:spacing w:after="0"/>
+              <w:jc w:val="center"/>
+            </w:pPr>
+            <w:r>
+              <w:rPr>
+                <w:sz w:val="16"/>
+              </w:rPr>
+              <w:t>0.688</w:t>
+            </w:r>
+          </w:p>
+        </w:tc>
+        <w:tc>
+          <w:tcPr>
+            <w:tcW w:type="dxa" w:w="1587"/>
+            <w:vAlign w:val="center"/>
+          </w:tcPr>
+          <w:p>
+            <w:pPr>
+              <w:spacing w:after="0"/>
+              <w:jc w:val="center"/>
+            </w:pPr>
+            <w:r>
+              <w:rPr>
+                <w:sz w:val="16"/>
+              </w:rPr>
+              <w:t>0.739</w:t>
+            </w:r>
+          </w:p>
+        </w:tc>
+        <w:tc>
+          <w:tcPr>
+            <w:tcW w:type="dxa" w:w="1417"/>
+            <w:vAlign w:val="center"/>
+          </w:tcPr>
+          <w:p>
+            <w:pPr>
+              <w:spacing w:after="0"/>
+              <w:jc w:val="center"/>
+            </w:pPr>
+            <w:r>
+              <w:rPr>
+                <w:sz w:val="16"/>
+              </w:rPr>
+              <w:t>3</w:t>
+            </w:r>
+          </w:p>
+        </w:tc>
+      </w:tr>
+      <w:tr>
+        <w:tc>
+          <w:tcPr>
+            <w:tcW w:type="dxa" w:w="1701"/>
+            <w:vAlign w:val="center"/>
+          </w:tcPr>
+          <w:p>
+            <w:pPr>
+              <w:spacing w:after="0"/>
+              <w:jc w:val="left"/>
+            </w:pPr>
+            <w:r>
+              <w:rPr>
+                <w:b/>
+                <w:sz w:val="16"/>
+              </w:rPr>
+              <w:t>Tekirdağ</w:t>
+            </w:r>
+          </w:p>
+        </w:tc>
+        <w:tc>
+          <w:tcPr>
+            <w:tcW w:type="dxa" w:w="1814"/>
+            <w:vAlign w:val="center"/>
+          </w:tcPr>
+          <w:p>
+            <w:pPr>
+              <w:spacing w:after="0"/>
+              <w:jc w:val="center"/>
+            </w:pPr>
+            <w:r>
+              <w:rPr>
+                <w:sz w:val="16"/>
+              </w:rPr>
+              <w:t>Primary plateau</w:t>
+            </w:r>
+          </w:p>
+        </w:tc>
+        <w:tc>
+          <w:tcPr>
+            <w:tcW w:type="dxa" w:w="907"/>
+            <w:vAlign w:val="center"/>
+          </w:tcPr>
+          <w:p>
+            <w:pPr>
+              <w:spacing w:after="0"/>
+              <w:jc w:val="center"/>
+            </w:pPr>
+            <w:r>
+              <w:rPr>
+                <w:sz w:val="16"/>
+              </w:rPr>
+              <w:t>40</w:t>
+            </w:r>
+          </w:p>
+        </w:tc>
+        <w:tc>
+          <w:tcPr>
+            <w:tcW w:type="dxa" w:w="1474"/>
+            <w:vAlign w:val="center"/>
+          </w:tcPr>
+          <w:p>
+            <w:pPr>
+              <w:spacing w:after="0"/>
+              <w:jc w:val="center"/>
+            </w:pPr>
+            <w:r>
+              <w:rPr>
+                <w:sz w:val="16"/>
+              </w:rPr>
+              <w:t>0.671</w:t>
+            </w:r>
+          </w:p>
+        </w:tc>
+        <w:tc>
+          <w:tcPr>
+            <w:tcW w:type="dxa" w:w="1587"/>
+            <w:vAlign w:val="center"/>
+          </w:tcPr>
+          <w:p>
+            <w:pPr>
+              <w:spacing w:after="0"/>
+              <w:jc w:val="center"/>
+            </w:pPr>
+            <w:r>
+              <w:rPr>
+                <w:sz w:val="16"/>
+              </w:rPr>
+              <w:t>0.700</w:t>
+            </w:r>
+          </w:p>
+        </w:tc>
+        <w:tc>
+          <w:tcPr>
+            <w:tcW w:type="dxa" w:w="1417"/>
+            <w:vAlign w:val="center"/>
+          </w:tcPr>
+          <w:p>
+            <w:pPr>
+              <w:spacing w:after="0"/>
+              <w:jc w:val="center"/>
+            </w:pPr>
+            <w:r>
+              <w:rPr>
+                <w:sz w:val="16"/>
+              </w:rPr>
+              <w:t>3</w:t>
+            </w:r>
+          </w:p>
+        </w:tc>
+      </w:tr>
+      <w:tr>
+        <w:tc>
+          <w:tcPr>
+            <w:tcW w:type="dxa" w:w="1701"/>
+            <w:vAlign w:val="center"/>
+          </w:tcPr>
+          <w:p>
+            <w:pPr>
+              <w:spacing w:after="0"/>
+              <w:jc w:val="left"/>
+            </w:pPr>
+            <w:r>
+              <w:rPr>
+                <w:b/>
+                <w:sz w:val="16"/>
+              </w:rPr>
+              <w:t>Uzunköprü</w:t>
+            </w:r>
+          </w:p>
+        </w:tc>
+        <w:tc>
+          <w:tcPr>
+            <w:tcW w:type="dxa" w:w="1814"/>
+            <w:vAlign w:val="center"/>
+          </w:tcPr>
+          <w:p>
+            <w:pPr>
+              <w:spacing w:after="0"/>
+              <w:jc w:val="center"/>
+            </w:pPr>
+            <w:r>
+              <w:rPr>
+                <w:sz w:val="16"/>
+              </w:rPr>
+              <w:t>Primary plateau</w:t>
+            </w:r>
+          </w:p>
+        </w:tc>
+        <w:tc>
+          <w:tcPr>
+            <w:tcW w:type="dxa" w:w="907"/>
+            <w:vAlign w:val="center"/>
+          </w:tcPr>
+          <w:p>
+            <w:pPr>
+              <w:spacing w:after="0"/>
+              <w:jc w:val="center"/>
+            </w:pPr>
+            <w:r>
+              <w:rPr>
+                <w:sz w:val="16"/>
+              </w:rPr>
+              <w:t>40</w:t>
+            </w:r>
+          </w:p>
+        </w:tc>
+        <w:tc>
+          <w:tcPr>
+            <w:tcW w:type="dxa" w:w="1474"/>
+            <w:vAlign w:val="center"/>
+          </w:tcPr>
+          <w:p>
+            <w:pPr>
+              <w:spacing w:after="0"/>
+              <w:jc w:val="center"/>
+            </w:pPr>
+            <w:r>
+              <w:rPr>
+                <w:sz w:val="16"/>
+              </w:rPr>
+              <w:t>0.600</w:t>
+            </w:r>
+          </w:p>
+        </w:tc>
+        <w:tc>
+          <w:tcPr>
+            <w:tcW w:type="dxa" w:w="1587"/>
+            <w:vAlign w:val="center"/>
+          </w:tcPr>
+          <w:p>
+            <w:pPr>
+              <w:spacing w:after="0"/>
+              <w:jc w:val="center"/>
+            </w:pPr>
+            <w:r>
+              <w:rPr>
+                <w:sz w:val="16"/>
+              </w:rPr>
+              <w:t>0.688</w:t>
+            </w:r>
+          </w:p>
+        </w:tc>
+        <w:tc>
+          <w:tcPr>
+            <w:tcW w:type="dxa" w:w="1417"/>
+            <w:vAlign w:val="center"/>
+          </w:tcPr>
+          <w:p>
+            <w:pPr>
+              <w:spacing w:after="0"/>
+              <w:jc w:val="center"/>
+            </w:pPr>
+            <w:r>
+              <w:rPr>
+                <w:sz w:val="16"/>
+              </w:rPr>
+              <w:t>4</w:t>
+            </w:r>
+          </w:p>
+        </w:tc>
+      </w:tr>
+      <w:tr>
+        <w:tc>
+          <w:tcPr>
+            <w:tcW w:type="dxa" w:w="1701"/>
+            <w:vAlign w:val="center"/>
+          </w:tcPr>
+          <w:p>
+            <w:pPr>
+              <w:spacing w:after="0"/>
+              <w:jc w:val="left"/>
+            </w:pPr>
+            <w:r>
+              <w:rPr>
+                <w:b/>
+                <w:sz w:val="16"/>
+              </w:rPr>
+              <w:t>İpsala</w:t>
+            </w:r>
+          </w:p>
+        </w:tc>
+        <w:tc>
+          <w:tcPr>
+            <w:tcW w:type="dxa" w:w="1814"/>
+            <w:vAlign w:val="center"/>
+          </w:tcPr>
+          <w:p>
+            <w:pPr>
+              <w:spacing w:after="0"/>
+              <w:jc w:val="center"/>
+            </w:pPr>
+            <w:r>
+              <w:rPr>
+                <w:sz w:val="16"/>
+              </w:rPr>
+              <w:t>Contrast valley</w:t>
+            </w:r>
+          </w:p>
+        </w:tc>
+        <w:tc>
+          <w:tcPr>
+            <w:tcW w:type="dxa" w:w="907"/>
+            <w:vAlign w:val="center"/>
+          </w:tcPr>
+          <w:p>
+            <w:pPr>
+              <w:spacing w:after="0"/>
+              <w:jc w:val="center"/>
+            </w:pPr>
+            <w:r>
+              <w:rPr>
+                <w:sz w:val="16"/>
+              </w:rPr>
+              <w:t>40</w:t>
+            </w:r>
+          </w:p>
+        </w:tc>
+        <w:tc>
+          <w:tcPr>
+            <w:tcW w:type="dxa" w:w="1474"/>
+            <w:vAlign w:val="center"/>
+          </w:tcPr>
+          <w:p>
+            <w:pPr>
+              <w:spacing w:after="0"/>
+              <w:jc w:val="center"/>
+            </w:pPr>
+            <w:r>
+              <w:rPr>
+                <w:sz w:val="16"/>
+              </w:rPr>
+              <w:t>0.280</w:t>
+            </w:r>
+          </w:p>
+        </w:tc>
+        <w:tc>
+          <w:tcPr>
+            <w:tcW w:type="dxa" w:w="1587"/>
+            <w:vAlign w:val="center"/>
+          </w:tcPr>
+          <w:p>
+            <w:pPr>
+              <w:spacing w:after="0"/>
+              <w:jc w:val="center"/>
+            </w:pPr>
+            <w:r>
+              <w:rPr>
+                <w:sz w:val="16"/>
+              </w:rPr>
+              <w:t>0.330</w:t>
+            </w:r>
+          </w:p>
+        </w:tc>
+        <w:tc>
+          <w:tcPr>
+            <w:tcW w:type="dxa" w:w="1417"/>
+            <w:vAlign w:val="center"/>
+          </w:tcPr>
+          <w:p>
+            <w:pPr>
+              <w:spacing w:after="0"/>
+              <w:jc w:val="center"/>
+            </w:pPr>
+            <w:r>
+              <w:rPr>
+                <w:sz w:val="16"/>
+              </w:rPr>
+              <w:t>4</w:t>
+            </w:r>
+          </w:p>
+        </w:tc>
+      </w:tr>
+    </w:tbl>
+    <w:p>
+      <w:r>
+        <w:t>Table S2. District VHI–SPEI-3 correlations over June–October by sub-period and by VCI/TCI normalisation baseline (Section 3.5). The plateau-to-İpsala gap is stable across sub-periods and survives a within-window normalisation.</w:t>
+      </w:r>
+    </w:p>
+    <w:tbl>
+      <w:tblPr>
+        <w:tblStyle w:val="TableGrid"/>
+        <w:tblW w:type="auto" w:w="0"/>
+        <w:tblLook w:firstColumn="1" w:firstRow="1" w:lastColumn="0" w:lastRow="0" w:noHBand="0" w:noVBand="1" w:val="04A0"/>
+      </w:tblPr>
+      <w:tblGrid>
+        <w:gridCol w:w="1837"/>
+        <w:gridCol w:w="1837"/>
+        <w:gridCol w:w="1837"/>
+        <w:gridCol w:w="1837"/>
+        <w:gridCol w:w="1837"/>
+      </w:tblGrid>
+      <w:tr>
+        <w:tc>
+          <w:tcPr>
+            <w:tcW w:type="dxa" w:w="1837"/>
+          </w:tcPr>
+          <w:p>
+            <w:r>
+              <w:t>Period</w:t>
+            </w:r>
+          </w:p>
+        </w:tc>
+        <w:tc>
+          <w:tcPr>
+            <w:tcW w:type="dxa" w:w="1837"/>
+          </w:tcPr>
+          <w:p>
+            <w:r>
+              <w:t>VCI/TCI baseline</w:t>
+            </w:r>
+          </w:p>
+        </w:tc>
+        <w:tc>
+          <w:tcPr>
+            <w:tcW w:type="dxa" w:w="1837"/>
+          </w:tcPr>
+          <w:p>
+            <w:r>
+              <w:t>Plateau mean r (range)</w:t>
+            </w:r>
+          </w:p>
+        </w:tc>
+        <w:tc>
+          <w:tcPr>
+            <w:tcW w:type="dxa" w:w="1837"/>
+          </w:tcPr>
+          <w:p>
+            <w:r>
+              <w:t>İpsala r</w:t>
+            </w:r>
+          </w:p>
+        </w:tc>
+        <w:tc>
+          <w:tcPr>
+            <w:tcW w:type="dxa" w:w="1837"/>
+          </w:tcPr>
+          <w:p>
+            <w:r>
+              <w:t>Gap</w:t>
+            </w:r>
+          </w:p>
+        </w:tc>
+      </w:tr>
+      <w:tr>
+        <w:tc>
+          <w:tcPr>
+            <w:tcW w:type="dxa" w:w="1837"/>
+          </w:tcPr>
+          <w:p>
+            <w:r>
+              <w:t>1985–2024</w:t>
+            </w:r>
+          </w:p>
+        </w:tc>
+        <w:tc>
+          <w:tcPr>
+            <w:tcW w:type="dxa" w:w="1837"/>
+          </w:tcPr>
+          <w:p>
+            <w:r>
+              <w:t>Full-period extrema (as in the paper)</w:t>
+            </w:r>
+          </w:p>
+        </w:tc>
+        <w:tc>
+          <w:tcPr>
+            <w:tcW w:type="dxa" w:w="1837"/>
+          </w:tcPr>
+          <w:p>
+            <w:r>
+              <w:t>0.521 (0.486–0.557)</w:t>
+            </w:r>
+          </w:p>
+        </w:tc>
+        <w:tc>
+          <w:tcPr>
+            <w:tcW w:type="dxa" w:w="1837"/>
+          </w:tcPr>
+          <w:p>
+            <w:r>
+              <w:t>0.217</w:t>
+            </w:r>
+          </w:p>
+        </w:tc>
+        <w:tc>
+          <w:tcPr>
+            <w:tcW w:type="dxa" w:w="1837"/>
+          </w:tcPr>
+          <w:p>
+            <w:r>
+              <w:t>0.304</w:t>
+            </w:r>
+          </w:p>
+        </w:tc>
+      </w:tr>
+      <w:tr>
+        <w:tc>
+          <w:tcPr>
+            <w:tcW w:type="dxa" w:w="1837"/>
+          </w:tcPr>
+          <w:p>
+            <w:r>
+              <w:t>1985–2012</w:t>
+            </w:r>
+          </w:p>
+        </w:tc>
+        <w:tc>
+          <w:tcPr>
+            <w:tcW w:type="dxa" w:w="1837"/>
+          </w:tcPr>
+          <w:p>
+            <w:r>
+              <w:t>Full-period extrema</w:t>
+            </w:r>
+          </w:p>
+        </w:tc>
+        <w:tc>
+          <w:tcPr>
+            <w:tcW w:type="dxa" w:w="1837"/>
+          </w:tcPr>
+          <w:p>
+            <w:r>
+              <w:t>0.518 (0.453–0.602)</w:t>
+            </w:r>
+          </w:p>
+        </w:tc>
+        <w:tc>
+          <w:tcPr>
+            <w:tcW w:type="dxa" w:w="1837"/>
+          </w:tcPr>
+          <w:p>
+            <w:r>
+              <w:t>0.206</w:t>
+            </w:r>
+          </w:p>
+        </w:tc>
+        <w:tc>
+          <w:tcPr>
+            <w:tcW w:type="dxa" w:w="1837"/>
+          </w:tcPr>
+          <w:p>
+            <w:r>
+              <w:t>0.312</w:t>
+            </w:r>
+          </w:p>
+        </w:tc>
+      </w:tr>
+      <w:tr>
+        <w:tc>
+          <w:tcPr>
+            <w:tcW w:type="dxa" w:w="1837"/>
+          </w:tcPr>
+          <w:p>
+            <w:r>
+              <w:t>2013–2024</w:t>
+            </w:r>
+          </w:p>
+        </w:tc>
+        <w:tc>
+          <w:tcPr>
+            <w:tcW w:type="dxa" w:w="1837"/>
+          </w:tcPr>
+          <w:p>
+            <w:r>
+              <w:t>Full-period extrema</w:t>
+            </w:r>
+          </w:p>
+        </w:tc>
+        <w:tc>
+          <w:tcPr>
+            <w:tcW w:type="dxa" w:w="1837"/>
+          </w:tcPr>
+          <w:p>
+            <w:r>
+              <w:t>0.600 (0.514–0.750)</w:t>
+            </w:r>
+          </w:p>
+        </w:tc>
+        <w:tc>
+          <w:tcPr>
+            <w:tcW w:type="dxa" w:w="1837"/>
+          </w:tcPr>
+          <w:p>
+            <w:r>
+              <w:t>0.287</w:t>
+            </w:r>
+          </w:p>
+        </w:tc>
+        <w:tc>
+          <w:tcPr>
+            <w:tcW w:type="dxa" w:w="1837"/>
+          </w:tcPr>
+          <w:p>
+            <w:r>
+              <w:t>0.313</w:t>
+            </w:r>
+          </w:p>
+        </w:tc>
+      </w:tr>
+      <w:tr>
+        <w:tc>
+          <w:tcPr>
+            <w:tcW w:type="dxa" w:w="1837"/>
+          </w:tcPr>
+          <w:p>
+            <w:r>
+              <w:t>2013–2024</w:t>
+            </w:r>
+          </w:p>
+        </w:tc>
+        <w:tc>
+          <w:tcPr>
+            <w:tcW w:type="dxa" w:w="1837"/>
+          </w:tcPr>
+          <w:p>
+            <w:r>
+              <w:t>Within-window extrema</w:t>
+            </w:r>
+          </w:p>
+        </w:tc>
+        <w:tc>
+          <w:tcPr>
+            <w:tcW w:type="dxa" w:w="1837"/>
+          </w:tcPr>
+          <w:p>
+            <w:r>
+              <w:t>0.528 (0.467–0.577)</w:t>
+            </w:r>
+          </w:p>
+        </w:tc>
+        <w:tc>
+          <w:tcPr>
+            <w:tcW w:type="dxa" w:w="1837"/>
+          </w:tcPr>
+          <w:p>
+            <w:r>
+              <w:t>0.252</w:t>
+            </w:r>
+          </w:p>
+        </w:tc>
+        <w:tc>
+          <w:tcPr>
+            <w:tcW w:type="dxa" w:w="1837"/>
+          </w:tcPr>
+          <w:p>
+            <w:r>
+              <w:t>0.276</w:t>
+            </w:r>
+          </w:p>
+        </w:tc>
+      </w:tr>
+    </w:tbl>
+    <w:p>
+      <w:pPr>
+        <w:spacing w:after="0"/>
+      </w:pPr>
+    </w:p>
+    <w:p>
+      <w:pPr>
+        <w:pStyle w:val="Heading2"/>
+      </w:pPr>
+      <w:r>
+        <w:t>Station figures</w:t>
+      </w:r>
+    </w:p>
+    <w:p>
+      <w:r>
+        <w:t>The same colours, axes and reference lines are used throughout to support direct comparison among stations.</w:t>
+      </w:r>
+    </w:p>
+    <w:p>
+      <w:r>
+        <w:br w:type="page"/>
+      </w:r>
+    </w:p>
+    <w:p>
+      <w:pPr>
+        <w:pStyle w:val="Heading1"/>
+      </w:pPr>
+      <w:r>
+        <w:t>Figure S1. Edirne</w:t>
+      </w:r>
+    </w:p>
+    <w:p>
+      <w:pPr>
+        <w:keepNext/>
+        <w:jc w:val="center"/>
+      </w:pPr>
+      <w:r>
+        <w:drawing>
+          <wp:inline>
+            <wp:extent cx="5760000" cy="4159772"/>
+            <wp:docPr id="1" name="Picture 1" title="Figure S1" descr="Two-panel time-series chart for Edirne, 1985 to 2024. The upper panel compares annual June–October SPI-3 and SPEI-3 with a minus-one drought reference. The lower panel shows annual June–October VHI with a 40-point stress reference."/>
+            <wp:cNvGraphicFramePr>
+              <a:graphicFrameLocks noChangeAspect="1"/>
+            </wp:cNvGraphicFramePr>
+            <a:graphic>
+              <a:graphicData uri="http://schemas.openxmlformats.org/drawingml/2006/picture">
+                <pic:pic>
+                  <pic:nvPicPr>
+                    <pic:cNvPr id="1" name="Figure_S1_edirne_SPI3_SPEI3_VHI.png"/>
+                    <pic:cNvPicPr/>
+                  </pic:nvPicPr>
+                  <pic:blipFill>
+                    <a:blip r:embed="rId9"/>
+                    <a:stretch>
+                      <a:fillRect/>
+                    </a:stretch>
+                  </pic:blipFill>
+                  <pic:spPr>
+                    <a:xfrm>
+                      <a:off x="0" y="0"/>
+                      <a:ext cx="5760000" cy="4159772"/>
+                    </a:xfrm>
+                    <a:prstGeom prst="rect"/>
+                  </pic:spPr>
+                </pic:pic>
+              </a:graphicData>
+            </a:graphic>
+          </wp:inline>
+        </w:drawing>
+      </w:r>
+    </w:p>
+    <w:p>
+      <w:pPr>
+        <w:pStyle w:val="CaptionText"/>
+      </w:pPr>
+      <w:r>
+        <w:t>Figure S1. Edirne (primary rainfed plateau domain), 1985–2024. (a) Annual June–October mean SPI-3 and flexibly standardized SPEI-3 from the matched meteorological station. (b) Annual June–October mean equal-weighted Landsat VHI for district cropland. Pearson correlations with VHI are r = 0.537 for SPI-3 and r = 0.544 for SPEI-3 (n = 40 years). The shaded interval identifies 2024.</w:t>
+      </w:r>
+    </w:p>
+    <w:p>
+      <w:r>
+        <w:br w:type="page"/>
+      </w:r>
+    </w:p>
+    <w:p>
+      <w:pPr>
+        <w:pStyle w:val="Heading1"/>
+      </w:pPr>
+      <w:r>
+        <w:t>Figure S2. Kırklareli</w:t>
+      </w:r>
+    </w:p>
+    <w:p>
+      <w:pPr>
+        <w:keepNext/>
+        <w:jc w:val="center"/>
+      </w:pPr>
+      <w:r>
+        <w:drawing>
+          <wp:inline>
+            <wp:extent cx="5760000" cy="4159772"/>
+            <wp:docPr id="2" name="Picture 2" title="Figure S2" descr="Two-panel time-series chart for Kırklareli, 1985 to 2024. The upper panel compares annual June–October SPI-3 and SPEI-3 with a minus-one drought reference. The lower panel shows annual June–October VHI with a 40-point stress reference."/>
+            <wp:cNvGraphicFramePr>
+              <a:graphicFrameLocks noChangeAspect="1"/>
+            </wp:cNvGraphicFramePr>
+            <a:graphic>
+              <a:graphicData uri="http://schemas.openxmlformats.org/drawingml/2006/picture">
+                <pic:pic>
+                  <pic:nvPicPr>
+                    <pic:cNvPr id="2" name="Figure_S2_kirklareli_SPI3_SPEI3_VHI.png"/>
+                    <pic:cNvPicPr/>
+                  </pic:nvPicPr>
+                  <pic:blipFill>
+                    <a:blip r:embed="rId10"/>
+                    <a:stretch>
+                      <a:fillRect/>
+                    </a:stretch>
+                  </pic:blipFill>
+                  <pic:spPr>
+                    <a:xfrm>
+                      <a:off x="0" y="0"/>
+                      <a:ext cx="5760000" cy="4159772"/>
+                    </a:xfrm>
+                    <a:prstGeom prst="rect"/>
+                  </pic:spPr>
+                </pic:pic>
+              </a:graphicData>
+            </a:graphic>
+          </wp:inline>
+        </w:drawing>
+      </w:r>
+    </w:p>
+    <w:p>
+      <w:pPr>
+        <w:pStyle w:val="CaptionText"/>
+      </w:pPr>
+      <w:r>
+        <w:t>Figure S2. Kırklareli (primary rainfed plateau domain), 1985–2024. (a) Annual June–October mean SPI-3 and flexibly standardized SPEI-3 from the matched meteorological station. (b) Annual June–October mean equal-weighted Landsat VHI for district cropland. Pearson correlations with VHI are r = 0.544 for SPI-3 and r = 0.584 for SPEI-3 (n = 40 years). The shaded interval identifies 2024.</w:t>
+      </w:r>
+    </w:p>
+    <w:p>
+      <w:r>
+        <w:br w:type="page"/>
+      </w:r>
+    </w:p>
+    <w:p>
+      <w:pPr>
+        <w:pStyle w:val="Heading1"/>
+      </w:pPr>
+      <w:r>
+        <w:t>Figure S3. Lüleburgaz</w:t>
+      </w:r>
+    </w:p>
+    <w:p>
+      <w:pPr>
+        <w:keepNext/>
+        <w:jc w:val="center"/>
+      </w:pPr>
+      <w:r>
+        <w:drawing>
+          <wp:inline>
+            <wp:extent cx="5760000" cy="4159772"/>
+            <wp:docPr id="3" name="Picture 3" title="Figure S3" descr="Two-panel time-series chart for Lüleburgaz, 1985 to 2024. The upper panel compares annual June–October SPI-3 and SPEI-3 with a minus-one drought reference. The lower panel shows annual June–October VHI with a 40-point stress reference."/>
+            <wp:cNvGraphicFramePr>
+              <a:graphicFrameLocks noChangeAspect="1"/>
+            </wp:cNvGraphicFramePr>
+            <a:graphic>
+              <a:graphicData uri="http://schemas.openxmlformats.org/drawingml/2006/picture">
+                <pic:pic>
+                  <pic:nvPicPr>
+                    <pic:cNvPr id="3" name="Figure_S3_luleburgaz_SPI3_SPEI3_VHI.png"/>
+                    <pic:cNvPicPr/>
+                  </pic:nvPicPr>
+                  <pic:blipFill>
+                    <a:blip r:embed="rId11"/>
+                    <a:stretch>
+                      <a:fillRect/>
+                    </a:stretch>
+                  </pic:blipFill>
+                  <pic:spPr>
+                    <a:xfrm>
+                      <a:off x="0" y="0"/>
+                      <a:ext cx="5760000" cy="4159772"/>
+                    </a:xfrm>
+                    <a:prstGeom prst="rect"/>
+                  </pic:spPr>
+                </pic:pic>
+              </a:graphicData>
+            </a:graphic>
+          </wp:inline>
+        </w:drawing>
+      </w:r>
+    </w:p>
+    <w:p>
+      <w:pPr>
+        <w:pStyle w:val="CaptionText"/>
+      </w:pPr>
+      <w:r>
+        <w:t>Figure S3. Lüleburgaz (primary rainfed plateau domain), 1985–2024. (a) Annual June–October mean SPI-3 and flexibly standardized SPEI-3 from the matched meteorological station. (b) Annual June–October mean equal-weighted Landsat VHI for district cropland. Pearson correlations with VHI are r = 0.404 for SPI-3 and r = 0.517 for SPEI-3 (n = 40 years). The shaded interval identifies 2024.</w:t>
+      </w:r>
+    </w:p>
+    <w:p>
+      <w:r>
+        <w:br w:type="page"/>
+      </w:r>
+    </w:p>
+    <w:p>
+      <w:pPr>
+        <w:pStyle w:val="Heading1"/>
+      </w:pPr>
+      <w:r>
+        <w:t>Figure S4. Çorlu</w:t>
+      </w:r>
+    </w:p>
+    <w:p>
+      <w:pPr>
+        <w:keepNext/>
+        <w:jc w:val="center"/>
+      </w:pPr>
+      <w:r>
+        <w:drawing>
+          <wp:inline>
+            <wp:extent cx="5760000" cy="4159772"/>
+            <wp:docPr id="4" name="Picture 4" title="Figure S4" descr="Two-panel time-series chart for Çorlu, 1985 to 2024. The upper panel compares annual June–October SPI-3 and SPEI-3 with a minus-one drought reference. The lower panel shows annual June–October VHI with a 40-point stress reference."/>
+            <wp:cNvGraphicFramePr>
+              <a:graphicFrameLocks noChangeAspect="1"/>
+            </wp:cNvGraphicFramePr>
+            <a:graphic>
+              <a:graphicData uri="http://schemas.openxmlformats.org/drawingml/2006/picture">
+                <pic:pic>
+                  <pic:nvPicPr>
+                    <pic:cNvPr id="4" name="Figure_S4_corlu_SPI3_SPEI3_VHI.png"/>
+                    <pic:cNvPicPr/>
+                  </pic:nvPicPr>
+                  <pic:blipFill>
+                    <a:blip r:embed="rId12"/>
+                    <a:stretch>
+                      <a:fillRect/>
+                    </a:stretch>
+                  </pic:blipFill>
+                  <pic:spPr>
+                    <a:xfrm>
+                      <a:off x="0" y="0"/>
+                      <a:ext cx="5760000" cy="4159772"/>
+                    </a:xfrm>
+                    <a:prstGeom prst="rect"/>
+                  </pic:spPr>
+                </pic:pic>
+              </a:graphicData>
+            </a:graphic>
+          </wp:inline>
+        </w:drawing>
+      </w:r>
+    </w:p>
+    <w:p>
+      <w:pPr>
+        <w:pStyle w:val="CaptionText"/>
+      </w:pPr>
+      <w:r>
+        <w:t>Figure S4. Çorlu (primary rainfed plateau domain), 1985–2024. (a) Annual June–October mean SPI-3 and flexibly standardized SPEI-3 from the matched meteorological station. (b) Annual June–October mean equal-weighted Landsat VHI for district cropland. Pearson correlations with VHI are r = 0.688 for SPI-3 and r = 0.739 for SPEI-3 (n = 40 years). The shaded interval identifies 2024.</w:t>
+      </w:r>
+    </w:p>
+    <w:p>
+      <w:r>
+        <w:br w:type="page"/>
+      </w:r>
+    </w:p>
+    <w:p>
+      <w:pPr>
+        <w:pStyle w:val="Heading1"/>
+      </w:pPr>
+      <w:r>
+        <w:t>Figure S5. Tekirdağ</w:t>
+      </w:r>
+    </w:p>
+    <w:p>
+      <w:pPr>
+        <w:keepNext/>
+        <w:jc w:val="center"/>
+      </w:pPr>
+      <w:r>
+        <w:drawing>
+          <wp:inline>
+            <wp:extent cx="5760000" cy="4159772"/>
+            <wp:docPr id="5" name="Picture 5" title="Figure S5" descr="Two-panel time-series chart for Tekirdağ, 1985 to 2024. The upper panel compares annual June–October SPI-3 and SPEI-3 with a minus-one drought reference. The lower panel shows annual June–October VHI with a 40-point stress reference."/>
+            <wp:cNvGraphicFramePr>
+              <a:graphicFrameLocks noChangeAspect="1"/>
+            </wp:cNvGraphicFramePr>
+            <a:graphic>
+              <a:graphicData uri="http://schemas.openxmlformats.org/drawingml/2006/picture">
+                <pic:pic>
+                  <pic:nvPicPr>
+                    <pic:cNvPr id="5" name="Figure_S5_tekirdag_SPI3_SPEI3_VHI.png"/>
+                    <pic:cNvPicPr/>
+                  </pic:nvPicPr>
+                  <pic:blipFill>
+                    <a:blip r:embed="rId13"/>
+                    <a:stretch>
+                      <a:fillRect/>
+                    </a:stretch>
+                  </pic:blipFill>
+                  <pic:spPr>
+                    <a:xfrm>
+                      <a:off x="0" y="0"/>
+                      <a:ext cx="5760000" cy="4159772"/>
+                    </a:xfrm>
+                    <a:prstGeom prst="rect"/>
+                  </pic:spPr>
+                </pic:pic>
+              </a:graphicData>
+            </a:graphic>
+          </wp:inline>
+        </w:drawing>
+      </w:r>
+    </w:p>
+    <w:p>
+      <w:pPr>
+        <w:pStyle w:val="CaptionText"/>
+      </w:pPr>
+      <w:r>
+        <w:t>Figure S5. Tekirdağ (primary rainfed plateau domain), 1985–2024. (a) Annual June–October mean SPI-3 and flexibly standardized SPEI-3 from the matched meteorological station. (b) Annual June–October mean equal-weighted Landsat VHI for district cropland. Pearson correlations with VHI are r = 0.671 for SPI-3 and r = 0.700 for SPEI-3 (n = 40 years). The shaded interval identifies 2024.</w:t>
+      </w:r>
+    </w:p>
+    <w:p>
+      <w:r>
+        <w:br w:type="page"/>
+      </w:r>
+    </w:p>
+    <w:p>
+      <w:pPr>
+        <w:pStyle w:val="Heading1"/>
+      </w:pPr>
+      <w:r>
+        <w:t>Figure S6. Uzunköprü</w:t>
+      </w:r>
+    </w:p>
+    <w:p>
+      <w:pPr>
+        <w:keepNext/>
+        <w:jc w:val="center"/>
+      </w:pPr>
+      <w:r>
+        <w:drawing>
+          <wp:inline>
+            <wp:extent cx="5760000" cy="4159772"/>
+            <wp:docPr id="6" name="Picture 6" title="Figure S6" descr="Two-panel time-series chart for Uzunköprü, 1985 to 2024. The upper panel compares annual June–October SPI-3 and SPEI-3 with a minus-one drought reference. The lower panel shows annual June–October VHI with a 40-point stress reference."/>
+            <wp:cNvGraphicFramePr>
+              <a:graphicFrameLocks noChangeAspect="1"/>
+            </wp:cNvGraphicFramePr>
+            <a:graphic>
+              <a:graphicData uri="http://schemas.openxmlformats.org/drawingml/2006/picture">
+                <pic:pic>
+                  <pic:nvPicPr>
+                    <pic:cNvPr id="6" name="Figure_S6_uzunkopru_SPI3_SPEI3_VHI.png"/>
+                    <pic:cNvPicPr/>
+                  </pic:nvPicPr>
+                  <pic:blipFill>
+                    <a:blip r:embed="rId14"/>
+                    <a:stretch>
+                      <a:fillRect/>
+                    </a:stretch>
+                  </pic:blipFill>
+                  <pic:spPr>
+                    <a:xfrm>
+                      <a:off x="0" y="0"/>
+                      <a:ext cx="5760000" cy="4159772"/>
+                    </a:xfrm>
+                    <a:prstGeom prst="rect"/>
+                  </pic:spPr>
+                </pic:pic>
+              </a:graphicData>
+            </a:graphic>
+          </wp:inline>
+        </w:drawing>
+      </w:r>
+    </w:p>
+    <w:p>
+      <w:pPr>
+        <w:pStyle w:val="CaptionText"/>
+      </w:pPr>
+      <w:r>
+        <w:t>Figure S6. Uzunköprü (primary rainfed plateau domain), 1985–2024. (a) Annual June–October mean SPI-3 and flexibly standardized SPEI-3 from the matched meteorological station. (b) Annual June–October mean equal-weighted Landsat VHI for district cropland. Pearson correlations with VHI are r = 0.600 for SPI-3 and r = 0.688 for SPEI-3 (n = 40 years). The shaded interval identifies 2024.</w:t>
+      </w:r>
+    </w:p>
+    <w:p>
+      <w:r>
+        <w:br w:type="page"/>
+      </w:r>
+    </w:p>
+    <w:p>
+      <w:pPr>
+        <w:pStyle w:val="Heading1"/>
+      </w:pPr>
+      <w:r>
+        <w:t>Figure S7. İpsala</w:t>
+      </w:r>
+    </w:p>
+    <w:p>
+      <w:pPr>
+        <w:keepNext/>
+        <w:jc w:val="center"/>
+      </w:pPr>
+      <w:r>
+        <w:drawing>
+          <wp:inline>
+            <wp:extent cx="5760000" cy="4159772"/>
+            <wp:docPr id="7" name="Picture 7" title="Figure S7" descr="Two-panel time-series chart for İpsala, 1985 to 2024. The upper panel compares annual June–October SPI-3 and SPEI-3 with a minus-one drought reference. The lower panel shows annual June–October VHI with a 40-point stress reference."/>
+            <wp:cNvGraphicFramePr>
+              <a:graphicFrameLocks noChangeAspect="1"/>
+            </wp:cNvGraphicFramePr>
+            <a:graphic>
+              <a:graphicData uri="http://schemas.openxmlformats.org/drawingml/2006/picture">
+                <pic:pic>
+                  <pic:nvPicPr>
+                    <pic:cNvPr id="7" name="Figure_S7_ipsala_SPI3_SPEI3_VHI.png"/>
+                    <pic:cNvPicPr/>
+                  </pic:nvPicPr>
+                  <pic:blipFill>
+                    <a:blip r:embed="rId15"/>
+                    <a:stretch>
+                      <a:fillRect/>
+                    </a:stretch>
+                  </pic:blipFill>
+                  <pic:spPr>
+                    <a:xfrm>
+                      <a:off x="0" y="0"/>
+                      <a:ext cx="5760000" cy="4159772"/>
+                    </a:xfrm>
+                    <a:prstGeom prst="rect"/>
+                  </pic:spPr>
+                </pic:pic>
+              </a:graphicData>
+            </a:graphic>
+          </wp:inline>
+        </w:drawing>
+      </w:r>
+    </w:p>
+    <w:p>
+      <w:pPr>
+        <w:pStyle w:val="CaptionText"/>
+      </w:pPr>
+      <w:r>
+        <w:t>Figure S7. İpsala (contrast valley domain), 1985–2024. (a) Annual June–October mean SPI-3 and flexibly standardized SPEI-3 from the matched meteorological station. (b) Annual June–October mean equal-weighted Landsat VHI for district cropland. Pearson correlations with VHI are r = 0.280 for SPI-3 and r = 0.330 for SPEI-3 (n = 40 years). The shaded interval identifies 2024.</w:t>
+      </w:r>
+    </w:p>
+    <w:sectPr/>
   </w:body>
 </w:document>
 </file>
@@ -1951,6 +3594,44 @@
     <w:name w:val="NormalTok"/>
     <w:basedOn w:val="VerbatimChar"/>
     <w:rPr/>
+  </w:style>
+  <w:style w:type="table" w:styleId="TableGrid">
+    <w:name w:val="Table Grid"/>
+    <w:basedOn w:val="TableNormal"/>
+    <w:uiPriority w:val="59"/>
+    <w:rsid w:val="00FC693F"/>
+    <w:pPr>
+      <w:spacing w:after="0" w:line="240" w:lineRule="auto"/>
+    </w:pPr>
+    <w:tblPr>
+      <w:tblInd w:w="0" w:type="dxa"/>
+      <w:tblBorders>
+        <w:top w:val="single" w:sz="4" w:space="0" w:color="auto"/>
+        <w:left w:val="single" w:sz="4" w:space="0" w:color="auto"/>
+        <w:bottom w:val="single" w:sz="4" w:space="0" w:color="auto"/>
+        <w:right w:val="single" w:sz="4" w:space="0" w:color="auto"/>
+        <w:insideH w:val="single" w:sz="4" w:space="0" w:color="auto"/>
+        <w:insideV w:val="single" w:sz="4" w:space="0" w:color="auto"/>
+      </w:tblBorders>
+      <w:tblCellMar>
+        <w:top w:w="0" w:type="dxa"/>
+        <w:left w:w="108" w:type="dxa"/>
+        <w:bottom w:w="0" w:type="dxa"/>
+        <w:right w:w="108" w:type="dxa"/>
+      </w:tblCellMar>
+    </w:tblPr>
+  </w:style>
+  <w:style w:type="paragraph" w:customStyle="1" w:styleId="CaptionText">
+    <w:name w:val="Caption Text"/>
+    <w:pPr>
+      <w:keepNext w:val="0"/>
+      <w:spacing w:before="60" w:after="140"/>
+    </w:pPr>
+    <w:rPr>
+      <w:rFonts w:ascii="Times New Roman" w:hAnsi="Times New Roman"/>
+      <w:i w:val="0"/>
+      <w:sz w:val="18"/>
+    </w:rPr>
   </w:style>
 </w:styles>
 </file>

</xml_diff>